<commit_message>
Update: Vollbetrieb ohne Strom Vorlage – Fehler korrigiert (DATUM, AP-Felder, Tippfehler)
</commit_message>
<xml_diff>
--- a/AMBA_Vollbetrieb_ohne_Strom_Vorlage.docx
+++ b/AMBA_Vollbetrieb_ohne_Strom_Vorlage.docx
@@ -1089,7 +1089,6 @@
         </w:rPr>
         <w:t xml:space="preserve"> der </w:t>
       </w:r>
-      <w:proofErr w:type="gramStart"/>
       <w:r>
         <w:rPr>
           <w:rFonts w:cstheme="majorHAnsi"/>
@@ -1109,15 +1108,7 @@
           <w:rFonts w:cstheme="majorHAnsi"/>
           <w:szCs w:val="20"/>
         </w:rPr>
-        <w:t>er</w:t>
-      </w:r>
-      <w:proofErr w:type="gramEnd"/>
-      <w:r>
-        <w:rPr>
-          <w:rFonts w:cstheme="majorHAnsi"/>
-          <w:szCs w:val="20"/>
-        </w:rPr>
-        <w:t xml:space="preserve"> </w:t>
+        <w:t xml:space="preserve">er </w:t>
       </w:r>
       <w:r>
         <w:rPr>
@@ -1126,21 +1117,12 @@
         </w:rPr>
         <w:t xml:space="preserve">dem </w:t>
       </w:r>
-      <w:proofErr w:type="spellStart"/>
-      <w:r>
-        <w:rPr>
-          <w:rFonts w:cstheme="majorHAnsi"/>
-          <w:szCs w:val="20"/>
-        </w:rPr>
-        <w:t>dem</w:t>
-      </w:r>
-      <w:proofErr w:type="spellEnd"/>
-      <w:r>
-        <w:rPr>
-          <w:rFonts w:cstheme="majorHAnsi"/>
-          <w:szCs w:val="20"/>
-        </w:rPr>
-        <w:t xml:space="preserve"> Eigentümer</w:t>
+      <w:r>
+        <w:rPr>
+          <w:rFonts w:cstheme="majorHAnsi"/>
+          <w:szCs w:val="20"/>
+        </w:rPr>
+        <w:t>Eigentümer</w:t>
       </w:r>
       <w:r>
         <w:rPr>
@@ -3064,7 +3046,13 @@
         <w:rPr>
           <w:rFonts w:cstheme="majorBidi"/>
         </w:rPr>
-        <w:t>als Bestandteil dieses Vertrages nach den einschlägigen Rechtsvorschriften und den allgemein anerkannten Regeln der Technik im erforderlichen Umfang durch. Zur vom Betreiber durchzuführenden Wartung gehören: Unterhaltung, Sichtprüfung, Reinigung, Messung, Prüfung des Ladepunktes und Schutzeinrichtung, Prüfsiegel, Prüfung des Backendsystems sowie der Kommunikationsschnittstelle. Der Betreiber spielt erforderlichenfalls auch Firmware-Updates auf, soweit sie vom Hersteller zur Verfügung gestellt werden. N</w:t>
+        <w:t xml:space="preserve">als Bestandteil dieses Vertrages nach den einschlägigen Rechtsvorschriften und den allgemein anerkannten Regeln der Technik im erforderlichen Umfang durch. Zur vom Betreiber durchzuführenden Wartung gehören: Unterhaltung, Sichtprüfung, Reinigung, Messung, Prüfung </w:t>
+      </w:r>
+      <w:r>
+        <w:rPr>
+          <w:rFonts w:cstheme="majorBidi"/>
+        </w:rPr>
+        <w:t>des Ladepunktes und Schutzeinrichtung, Prüfsiegel, Prüfung des Backendsystems sowie der Kommunikationsschnittstelle. Der Betreiber spielt erforderlichenfalls auch Firmware-Updates auf, soweit sie vom Hersteller zur Verfügung gestellt werden. N</w:t>
       </w:r>
       <w:r>
         <w:rPr>
@@ -3252,6 +3240,7 @@
           <w:rFonts w:cstheme="majorHAnsi"/>
           <w:szCs w:val="20"/>
         </w:rPr>
+        <w:lastRenderedPageBreak/>
         <w:t>Die vorherige Mitteilung ist entbehrlich, soweit Gefahr in Verzug vorliegt; in diesem Fall muss die Mitteilung unverzüglich nachgeholt werden und Anlass, Zeit und Umfang der durchgeführten Maßnahmen enthalten.</w:t>
       </w:r>
     </w:p>
@@ -3278,15 +3267,7 @@
           <w:rFonts w:cstheme="majorHAnsi"/>
           <w:szCs w:val="20"/>
         </w:rPr>
-        <w:t xml:space="preserve">Während der Wartungen sind unter Umständen keine Ladevorgänge an den jeweiligen Ladeeinrichtungen möglich. Der Betreiber wird die </w:t>
-      </w:r>
-      <w:r>
-        <w:rPr>
-          <w:rFonts w:cstheme="majorHAnsi"/>
-          <w:szCs w:val="20"/>
-        </w:rPr>
-        <w:lastRenderedPageBreak/>
-        <w:t>wartungsbedingten Ausfallzeiten so gering wie möglich halten. Der Kunde hat auf Hinweis des Betreibers im Rahmen seiner Möglichkeiten dafür Sorge zu tragen, dass die Stellplätze an den Ladeeinrichtungen im Zeitraum der Wartung nicht durch Fahrzeuge belegt sind.</w:t>
+        <w:t>Während der Wartungen sind unter Umständen keine Ladevorgänge an den jeweiligen Ladeeinrichtungen möglich. Der Betreiber wird die wartungsbedingten Ausfallzeiten so gering wie möglich halten. Der Kunde hat auf Hinweis des Betreibers im Rahmen seiner Möglichkeiten dafür Sorge zu tragen, dass die Stellplätze an den Ladeeinrichtungen im Zeitraum der Wartung nicht durch Fahrzeuge belegt sind.</w:t>
       </w:r>
     </w:p>
     <w:p>
@@ -3585,14 +3566,7 @@
           <w:rFonts w:cstheme="majorHAnsi"/>
           <w:szCs w:val="20"/>
         </w:rPr>
-        <w:t xml:space="preserve">Fehleraufnahme, Dokumentation und Erstellung eines Service-Tickets zur Definition geeigneter Maßnahmen und Behebung der Störung durch das Hersteller Service-Ticket System, </w:t>
-      </w:r>
-      <w:r>
-        <w:rPr>
-          <w:rFonts w:cstheme="majorHAnsi"/>
-          <w:szCs w:val="20"/>
-        </w:rPr>
-        <w:t xml:space="preserve">soweit ein Fernzugriff möglich ist. Nach Maßnahmendefinition zur Störungsbehebung erfolgt ein Einsatz durch den Service-Techniker des Herstellers. Hat der Kunde die Beschaffung der Ladeinrichtung über Dritte abgewickelt, ist die Fehleraufnahme, Dokumentation und Service-Ticketerstellung kostenpflichtig nach </w:t>
+        <w:t xml:space="preserve">Fehleraufnahme, Dokumentation und Erstellung eines Service-Tickets zur Definition geeigneter Maßnahmen und Behebung der Störung durch das Hersteller Service-Ticket System, soweit ein Fernzugriff möglich ist. Nach Maßnahmendefinition zur Störungsbehebung erfolgt ein Einsatz durch den Service-Techniker des Herstellers. Hat der Kunde die Beschaffung der Ladeinrichtung über Dritte abgewickelt, ist die Fehleraufnahme, Dokumentation und Service-Ticketerstellung kostenpflichtig nach </w:t>
       </w:r>
       <w:r>
         <w:rPr>
@@ -3708,6 +3682,7 @@
         <w:rPr>
           <w:rFonts w:cstheme="majorHAnsi"/>
         </w:rPr>
+        <w:lastRenderedPageBreak/>
         <w:t>Stromversorgung der Ladeeinrichtungen</w:t>
       </w:r>
     </w:p>
@@ -3887,15 +3862,7 @@
           <w:rFonts w:cstheme="majorHAnsi"/>
           <w:szCs w:val="20"/>
         </w:rPr>
-        <w:t xml:space="preserve"> setzt die vorherige Registrierung der jeweiligen Karte </w:t>
-      </w:r>
-      <w:r>
-        <w:rPr>
-          <w:rFonts w:cstheme="majorHAnsi"/>
-          <w:szCs w:val="20"/>
-        </w:rPr>
-        <w:lastRenderedPageBreak/>
-        <w:t xml:space="preserve">durch den jeweiligen Nutzer der Ladekarte voraus. Nach der Registrierung schaltet der </w:t>
+        <w:t xml:space="preserve"> setzt die vorherige Registrierung der jeweiligen Karte durch den jeweiligen Nutzer der Ladekarte voraus. Nach der Registrierung schaltet der </w:t>
       </w:r>
       <w:r>
         <w:rPr>
@@ -4452,42 +4419,19 @@
         </w:rPr>
         <w:t xml:space="preserve">Rechnungen für Zahlungen nach diesem Vertrag sind </w:t>
       </w:r>
-      <w:sdt>
-        <w:sdtPr>
-          <w:rPr>
-            <w:rStyle w:val="Formatvorlage11"/>
-            <w:rFonts w:asciiTheme="majorHAnsi" w:hAnsiTheme="majorHAnsi" w:cstheme="majorHAnsi"/>
-          </w:rPr>
-          <w:alias w:val="Anzahl Tage des Zahlungsziels"/>
-          <w:tag w:val="Anzahl Tage des Zahlungsziels"/>
-          <w:id w:val="-384645438"/>
-          <w:placeholder>
-            <w:docPart w:val="43425BF57C0D4F8F8C24203B8D721051"/>
-          </w:placeholder>
-          <w:text/>
-        </w:sdtPr>
-        <w:sdtEndPr>
-          <w:rPr>
-            <w:rStyle w:val="Absatz-Standardschriftart"/>
-            <w:szCs w:val="20"/>
-          </w:rPr>
-        </w:sdtEndPr>
-        <w:sdtContent>
-          <w:r>
-            <w:rPr>
-              <w:rStyle w:val="Formatvorlage11"/>
-              <w:rFonts w:asciiTheme="majorHAnsi" w:hAnsiTheme="majorHAnsi" w:cstheme="majorHAnsi"/>
-            </w:rPr>
-            <w:t>14</w:t>
-          </w:r>
-        </w:sdtContent>
-      </w:sdt>
-      <w:r>
-        <w:rPr>
-          <w:rFonts w:cstheme="majorHAnsi"/>
-          <w:szCs w:val="20"/>
-        </w:rPr>
-        <w:t xml:space="preserve"> Tage nach Zugang der Zahlungsaufforderung fällig und ohne Abzug zu zahlen. Maßgeblich für die Rechtzeitigkeit der Zahlung ist die Wertstellung auf folgendem Konto des Zahlungsempfängers.</w:t>
+      <w:r>
+        <w:rPr>
+          <w:rStyle w:val="Formatvorlage11"/>
+          <w:rFonts w:asciiTheme="majorHAnsi" w:hAnsiTheme="majorHAnsi" w:cstheme="majorHAnsi"/>
+        </w:rPr>
+        <w:t xml:space="preserve">30 </w:t>
+      </w:r>
+      <w:r>
+        <w:rPr>
+          <w:rFonts w:cstheme="majorHAnsi"/>
+          <w:szCs w:val="20"/>
+        </w:rPr>
+        <w:t>Tage nach Zugang der Zahlungsaufforderung fällig und ohne Abzug zu zahlen. Maßgeblich für die Rechtzeitigkeit der Zahlung ist die Wertstellung auf folgendem Konto des Zahlungsempfängers.</w:t>
       </w:r>
     </w:p>
     <w:p>
@@ -4736,7 +4680,15 @@
           <w:rFonts w:cstheme="majorHAnsi"/>
           <w:szCs w:val="20"/>
         </w:rPr>
-        <w:t>Der Betreiber ist berechtigt, die Preise für den Betrieb und die Wartung der Ladeeinrichtungen durch einseitige Leistungsbestimmung nach billigem Ermessen gemäß § 315 BGB anzupassen, wenn sich während der Laufzeit des Vertrages die wirtschaftlichen Rahmenbedingungen für die Erbringung der Leistungsverpflichtungen gemäß diesem Vertrag ändern. Dies meint insbesondere die Kosten für die Beschaffung der Software, Energie, die Nutzung von Kommunikationsnetzen, von Cloud-Infrastrukturleistungen sowie sonstige Änderungen der wirtschaftlichen und rechtlichen Rahmenstrukturen. Eine Preisanpassung bedarf der schriftlichen Ankündigung. Eine solche Anhebung tritt frühestens drei Monate nach Ablauf des Monats in Kraft, in dem der Auftragnehmer die Änderung mitgeteilt hat. Sie darf die Vergütung des vorausgehenden Zwölfmonatszeitraumes um nicht mehr als 15 % überschreiten.</w:t>
+        <w:t xml:space="preserve">Der Betreiber ist berechtigt, die Preise für den Betrieb und die Wartung der Ladeeinrichtungen durch einseitige Leistungsbestimmung nach billigem Ermessen gemäß § 315 BGB anzupassen, wenn sich während der Laufzeit des Vertrages die wirtschaftlichen Rahmenbedingungen für die Erbringung der </w:t>
+      </w:r>
+      <w:r>
+        <w:rPr>
+          <w:rFonts w:cstheme="majorHAnsi"/>
+          <w:szCs w:val="20"/>
+        </w:rPr>
+        <w:lastRenderedPageBreak/>
+        <w:t>Leistungsverpflichtungen gemäß diesem Vertrag ändern. Dies meint insbesondere die Kosten für die Beschaffung der Software, Energie, die Nutzung von Kommunikationsnetzen, von Cloud-Infrastrukturleistungen sowie sonstige Änderungen der wirtschaftlichen und rechtlichen Rahmenstrukturen. Eine Preisanpassung bedarf der schriftlichen Ankündigung. Eine solche Anhebung tritt frühestens drei Monate nach Ablauf des Monats in Kraft, in dem der Auftragnehmer die Änderung mitgeteilt hat. Sie darf die Vergütung des vorausgehenden Zwölfmonatszeitraumes um nicht mehr als 15 % überschreiten.</w:t>
       </w:r>
       <w:r>
         <w:rPr>
@@ -4746,11 +4698,7 @@
         <w:t xml:space="preserve"> </w:t>
       </w:r>
       <w:r>
-        <w:t xml:space="preserve">Teilt der Betreiber dem Kunden eine </w:t>
-      </w:r>
-      <w:r>
-        <w:lastRenderedPageBreak/>
-        <w:t xml:space="preserve">Preisanpassung nach diesem Absatz mit, ist der Kunde berechtigt, den Vertrag ohne Einhaltung einer weiteren Kündigungsfrist zum Zeitpunkt des Wirksamwerdens der Preisanpassung außerordentlich zu kündigen. Die Kündigung bedarf der Textform und muss spätestens </w:t>
+        <w:t xml:space="preserve">Teilt der Betreiber dem Kunden eine Preisanpassung nach diesem Absatz mit, ist der Kunde berechtigt, den Vertrag ohne Einhaltung einer weiteren Kündigungsfrist zum Zeitpunkt des Wirksamwerdens der Preisanpassung außerordentlich zu kündigen. Die Kündigung bedarf der Textform und muss spätestens </w:t>
       </w:r>
       <w:r>
         <w:rPr>
@@ -4853,15 +4801,13 @@
         </w:rPr>
       </w:pPr>
       <w:r>
-        <w:t xml:space="preserve">Der Betreiber sowie von ihm beauftragte Dritte sind berechtigt, das Grundstück zur Ausübung der nach diesem Vertrag eingeräumten Rechte zu betreten. Zutritt wird dem Betreiber nach vorheriger Ankündigung und Abstimmung mit der zuständigen Fachabteilung des </w:t>
-      </w:r>
-      <w:proofErr w:type="spellStart"/>
-      <w:r>
-        <w:t>Kundenngewährt</w:t>
-      </w:r>
-      <w:proofErr w:type="spellEnd"/>
-      <w:r>
-        <w:t xml:space="preserve">. Die Ankündigung soll in der Regel mindestens </w:t>
+        <w:t>Der Betreiber sowie von ihm beauftragte Dritte sind berechtigt, das Grundstück zur Ausübung der nach diesem Vertrag eingeräumten Rechte zu betreten. Zutritt wird dem Betreiber nach vorheriger Ankündigung und Abstimmung mit der zuständigen Fachabteilung des Kunden</w:t>
+      </w:r>
+      <w:r>
+        <w:t xml:space="preserve"> </w:t>
+      </w:r>
+      <w:r>
+        <w:t xml:space="preserve">gewährt. Die Ankündigung soll in der Regel mindestens </w:t>
       </w:r>
       <w:r>
         <w:rPr>
@@ -5170,7 +5116,11 @@
         </w:rPr>
       </w:pPr>
       <w:r>
-        <w:t>Bei Unterbrechungen oder Unregelmäßigkeiten der Stromversorgung, die auf Störungen des Netzbetriebs, des Netzanschlusses oder der elektrischen Anlage des Kunden beruhen, ist der Betreiber für die Dauer und den Umfang der Beeinträchtigung von seiner Pflicht zum Betrieb der Ladeeinrichtungen befreit. Dies gilt nicht, wenn die Störung vom Betreiber zu vertreten ist. Die Vertragspartner unterstützen sich gegenseitig bei der Aufklärung der Ursachen einer Störung und erteilen einander auf Verlangen die hierfür erforderlichen und zumutbar verfügbaren Informationen</w:t>
+        <w:t xml:space="preserve">Bei Unterbrechungen oder Unregelmäßigkeiten der Stromversorgung, die auf Störungen des Netzbetriebs, des Netzanschlusses oder der elektrischen Anlage des Kunden beruhen, ist der Betreiber für die Dauer und den Umfang der Beeinträchtigung von seiner Pflicht zum Betrieb der Ladeeinrichtungen befreit. Dies gilt nicht, wenn die Störung vom Betreiber zu vertreten ist. Die Vertragspartner unterstützen sich gegenseitig bei der Aufklärung der Ursachen einer Störung und erteilen einander auf </w:t>
+      </w:r>
+      <w:r>
+        <w:lastRenderedPageBreak/>
+        <w:t>Verlangen die hierfür erforderlichen und zumutbar verfügbaren Informationen</w:t>
       </w:r>
       <w:r>
         <w:rPr>
@@ -5194,11 +5144,7 @@
         </w:rPr>
       </w:pPr>
       <w:r>
-        <w:t xml:space="preserve">Kann eine Vertragspartei ihre Leistungen aufgrund von Umständen nicht oder nur mit unverhältnismäßigem Aufwand erbringen, die außerhalb ihres Einflussbereichs liegen und auch bei Anwendung zumutbarer Sorgfalt nicht vermeidbar sind (insbesondere höhere Gewalt wie Naturkatastrophen, Krieg, Arbeitskampfmaßnahmen oder behördliche Anordnungen), ruhen die betroffenen Leistungspflichten für die Dauer der Beeinträchtigung. Die Parteien werden sich gegenseitig unverzüglich über das </w:t>
-      </w:r>
-      <w:r>
-        <w:lastRenderedPageBreak/>
-        <w:t>Vorliegen und die voraussichtliche Dauer solcher Umstände informieren</w:t>
+        <w:t>Kann eine Vertragspartei ihre Leistungen aufgrund von Umständen nicht oder nur mit unverhältnismäßigem Aufwand erbringen, die außerhalb ihres Einflussbereichs liegen und auch bei Anwendung zumutbarer Sorgfalt nicht vermeidbar sind (insbesondere höhere Gewalt wie Naturkatastrophen, Krieg, Arbeitskampfmaßnahmen oder behördliche Anordnungen), ruhen die betroffenen Leistungspflichten für die Dauer der Beeinträchtigung. Die Parteien werden sich gegenseitig unverzüglich über das Vorliegen und die voraussichtliche Dauer solcher Umstände informieren</w:t>
       </w:r>
       <w:r>
         <w:rPr>
@@ -5281,17 +5227,8 @@
           <w:rFonts w:cstheme="majorHAnsi"/>
           <w:szCs w:val="20"/>
         </w:rPr>
-        <w:t xml:space="preserve">Die Ersatzpflicht nach §2 des Haftpflichtgesetzes wegen Sachschäden ist gegenüber einer juristischen Person des öffentlichen Rechts, einem öffentlich-rechtlichen Sondervermögen oder einem Kaufmann ausgeschlossen. Soweit gesetzlich zulässig, bleiben weitergehende Haftungsbeschränkungen nach zwingenden gesetzlichen Vorschriften </w:t>
-      </w:r>
-      <w:proofErr w:type="gramStart"/>
-      <w:r>
-        <w:rPr>
-          <w:rFonts w:cstheme="majorHAnsi"/>
-          <w:szCs w:val="20"/>
-        </w:rPr>
-        <w:t>unberührt..</w:t>
-      </w:r>
-      <w:proofErr w:type="gramEnd"/>
+        <w:t>Die Ersatzpflicht nach §2 des Haftpflichtgesetzes wegen Sachschäden ist gegenüber einer juristischen Person des öffentlichen Rechts, einem öffentlich-rechtlichen Sondervermögen oder einem Kaufmann ausgeschlossen. Soweit gesetzlich zulässig, bleiben weitergehende Haftungsbeschränkungen nach zwingenden gesetzlichen Vorschriften unberührt.</w:t>
+      </w:r>
     </w:p>
     <w:p>
       <w:pPr>
@@ -5308,7 +5245,10 @@
         </w:rPr>
       </w:pPr>
       <w:r>
-        <w:t>Der geschädigte Vertragspartner wird den anderen Vertragspartner über erkannte Schäden oder Mängel möglichst unverzüglich informieren, damit geeignete Maßnahmen zur Schadensminderung ergriffen werden können</w:t>
+        <w:t>Der geschädigte Vertragspartner wird den anderen Vertragspartner über erkannte Schäden oder Män</w:t>
+      </w:r>
+      <w:r>
+        <w:t>gel möglichst unverzüglich informieren, damit geeignete Maßnahmen zur Schadensminderung ergriffen werden können</w:t>
       </w:r>
       <w:r>
         <w:rPr>
@@ -5602,6 +5542,7 @@
           <w:rFonts w:cstheme="majorHAnsi"/>
           <w:szCs w:val="20"/>
         </w:rPr>
+        <w:lastRenderedPageBreak/>
         <w:t>die andere Partei länger als vierzehn Tage in Folge oder mehr als dreißig Tage innerhalb eines Zeitraums von drei Monaten von ihren vertraglichen Verpflichtungen aufgrund höherer Gewalt befreit war.</w:t>
       </w:r>
     </w:p>
@@ -5624,15 +5565,7 @@
           <w:rFonts w:cstheme="majorHAnsi"/>
           <w:szCs w:val="20"/>
         </w:rPr>
-        <w:t xml:space="preserve">eine negative Auskunft insbesondere zu folgenden Punkten vorliegt: erfolglose Zwangsvollstreckung, erfolglose Pfändung, eidesstattliche Versicherung zum Vermögen, Restschuldbefreiung, </w:t>
-      </w:r>
-      <w:r>
-        <w:rPr>
-          <w:rFonts w:cstheme="majorHAnsi"/>
-          <w:szCs w:val="20"/>
-        </w:rPr>
-        <w:lastRenderedPageBreak/>
-        <w:t>oder wenn ein Zwangsvollstreckungsverfahren gegen die andere Partei eingeleitet wurde.</w:t>
+        <w:t>eine negative Auskunft insbesondere zu folgenden Punkten vorliegt: erfolglose Zwangsvollstreckung, erfolglose Pfändung, eidesstattliche Versicherung zum Vermögen, Restschuldbefreiung, oder wenn ein Zwangsvollstreckungsverfahren gegen die andere Partei eingeleitet wurde.</w:t>
       </w:r>
     </w:p>
     <w:p>
@@ -5776,14 +5709,14 @@
           <w:rFonts w:cstheme="majorHAnsi"/>
           <w:szCs w:val="20"/>
         </w:rPr>
-        <w:t xml:space="preserve">, BGB, EnWG, EEG, höchstrichterliche Rechtsprechung, Entscheidungen der Bundesnetzagentur). Das vertragliche Äquivalenzverhältnis kann nach Vertragsschluss durch unvorhersehbare Änderungen der gesetzlichen oder sonstigen Rahmenbedingungen (z. B. durch Gesetzesänderungen, sofern deren konkreter Inhalt nicht bereits – etwa in der Phase zwischen dem Abschluss des förmlichen Gesetzgebungsverfahrens und dem Inkrafttreten – absehbar war), die der Betreiber nicht veranlasst und auf die er auch keinen Einfluss hat, in nicht unbedeutendem Maße gestört werden. Ebenso kann nach Vertragsschluss eine im Vertrag und/oder diesen Bedingungen entstandene Lücke nicht unerhebliche Schwierigkeiten bei der Durchführung des Vertrages entstehen lassen (etwa, wenn die Rechtsprechung eine Klausel für unwirksam erklärt), die nur durch eine Anpassung oder Ergänzung zu beseitigen sind. In solchen Fällen ist der Betreiber verpflichtet, den Vertrag und diese Bedingungen unverzüglich insoweit </w:t>
-      </w:r>
-      <w:r>
-        <w:rPr>
-          <w:rFonts w:cstheme="majorHAnsi"/>
-          <w:szCs w:val="20"/>
-        </w:rPr>
-        <w:t xml:space="preserve">anzupassen und/oder zu ergänzen, als es die Wiederherstellung des Äquivalenzverhältnisses von Leistung und Gegenleistung und/oder der Ausgleich entstandener Vertragslücken zur zumutbaren Fort- und Durchführung des Vertragsverhältnisses erforderlich macht (z. B. mangels gesetzlicher Überleitungsbestimmungen). Anpassungen des Vertrages und dieser Bedingungen nach dieser Ziffer sind nur zum Monatsersten möglich. Die Anpassung wird nur wirksam, wenn der Betreiber dem Kunden die Anpassung spätestens sechs Wochen vor dem geplanten Wirksamwerden in Textform mitteilt. In diesem Fall hat der Kunde das Recht, den Vertrag ohne Einhaltung einer Kündigungsfrist zum Zeitpunkt des Wirksamwerdens der Vertragsanpassung zu kündigen. Hierauf wird der Kunde vom Betreiber in der Mitteilung gesondert hingewiesen. </w:t>
+        <w:t>, BGB, EnWG, EEG, höchstrichterliche Rechtsprechung, Entscheidungen der Bundesnetzagentur). Das vertragliche Äquivalenzverhältnis kann nach Vertragsschluss durch unvorhersehbare Änderungen der gesetzlichen oder sonstigen Rahmenbedingungen (z. B. durch Gesetzesänderungen, sofern deren konkreter Inhalt nicht bereits – etwa in der Phase zwischen dem Abschluss des förmlichen Gesetzgebungsverfahrens und dem Inkrafttreten – absehbar war), die der Betreiber nicht veranlasst und auf die er auch kei</w:t>
+      </w:r>
+      <w:r>
+        <w:rPr>
+          <w:rFonts w:cstheme="majorHAnsi"/>
+          <w:szCs w:val="20"/>
+        </w:rPr>
+        <w:t xml:space="preserve">nen Einfluss hat, in nicht unbedeutendem Maße gestört werden. Ebenso kann nach Vertragsschluss eine im Vertrag und/oder diesen Bedingungen entstandene Lücke nicht unerhebliche Schwierigkeiten bei der Durchführung des Vertrages entstehen lassen (etwa, wenn die Rechtsprechung eine Klausel für unwirksam erklärt), die nur durch eine Anpassung oder Ergänzung zu beseitigen sind. In solchen Fällen ist der Betreiber verpflichtet, den Vertrag und diese Bedingungen unverzüglich insoweit anzupassen und/oder zu ergänzen, als es die Wiederherstellung des Äquivalenzverhältnisses von Leistung und Gegenleistung und/oder der Ausgleich entstandener Vertragslücken zur zumutbaren Fort- und Durchführung des Vertragsverhältnisses erforderlich macht (z. B. mangels gesetzlicher Überleitungsbestimmungen). Anpassungen des Vertrages und dieser Bedingungen nach dieser Ziffer sind nur zum Monatsersten möglich. Die Anpassung wird nur wirksam, wenn der Betreiber dem Kunden die Anpassung spätestens sechs Wochen vor dem geplanten Wirksamwerden in Textform mitteilt. In diesem Fall hat der Kunde das Recht, den Vertrag ohne Einhaltung einer Kündigungsfrist zum Zeitpunkt des Wirksamwerdens der Vertragsanpassung zu kündigen. Hierauf wird der Kunde vom Betreiber in der Mitteilung gesondert hingewiesen. </w:t>
       </w:r>
       <w:r>
         <w:t xml:space="preserve">Dieses Kündigungsrecht gilt als außerordentliches Kündigungsrecht im Sinne des § 15 dieses Vertrages und ist in Textform gegenüber dem Betreiber geltend zu machen. Die Kündigung muss spätestens </w:t>
@@ -5837,7 +5770,15 @@
           <w:rFonts w:cstheme="majorHAnsi"/>
           <w:szCs w:val="20"/>
         </w:rPr>
-        <w:t>Der Betreiber ist berechtigt, sich zur Erfüllung seiner Verpflichtungen nach diesem Vertrag Dritter als Erfüllungsgehilfen im Sinne des § 278 BGB zu bedienen, sofern sichergestellt ist, dass die Leistungen sach- und fachgerecht durchgeführt werden. Der Betreiber ist insbesondere berechtigt, sich zur Erfüllung einzelner Leistungspflichten aus diesem Vertrag Nachunternehmer zu bedienen. Dies betrifft insbesondere (a) die Abrechnung der Ladevorgänge sowie (b) Support- und Wartungsleistungen in Bezug auf die vom Nachunternehmer bereitgestellte Softwarelösungen, die im Rahmen dieses Vertrages als Verwaltungs- und Abrechnungssystem für die Ladeeinrichtungen eingesetzt wird. Der Betreiber bleibt gegenüber dem Kunden alleiniger Vertragspartner.</w:t>
+        <w:t>Der Betreiber ist berechtigt, sich zur Erfüllung seiner Verpflichtungen nach diesem Vertrag Dritter als Erfüllungsgehilfen im Sinne des § 278 BGB zu bedienen, sofern sichergestellt ist, dass die Leistungen sach- und fachgerecht durchgeführt werden. Der Betreiber ist insbesondere berechtigt, sich zur Erfüllung einzelner Leistungspflichten aus diesem Vertrag Nachunternehmer zu bedienen. Dies betrifft insbesondere (a) die Abrechnung der Ladevorgänge sowie (b) Support- und Wartungsleistungen in Be</w:t>
+      </w:r>
+      <w:r>
+        <w:rPr>
+          <w:rFonts w:cstheme="majorHAnsi"/>
+          <w:szCs w:val="20"/>
+        </w:rPr>
+        <w:lastRenderedPageBreak/>
+        <w:t>zug auf die vom Nachunternehmer bereitgestellte Softwarelösungen, die im Rahmen dieses Vertrages als Verwaltungs- und Abrechnungssystem für die Ladeeinrichtungen eingesetzt wird. Der Betreiber bleibt gegenüber dem Kunden alleiniger Vertragspartner.</w:t>
       </w:r>
     </w:p>
     <w:p>
@@ -5881,15 +5822,7 @@
           <w:rFonts w:cstheme="majorHAnsi"/>
           <w:szCs w:val="20"/>
         </w:rPr>
-        <w:t xml:space="preserve">Beide Parteien sind berechtigt, mit Zustimmung der jeweils anderen Partei, die Rechte und Pflichten aus </w:t>
-      </w:r>
-      <w:r>
-        <w:rPr>
-          <w:rFonts w:cstheme="majorHAnsi"/>
-          <w:szCs w:val="20"/>
-        </w:rPr>
-        <w:lastRenderedPageBreak/>
-        <w:t>dem Vertrag als Gesamtheit auf einen Dritten zu übertragen. Der Betreiber hat dem Kunden nachzuweisen, dass der Dritte personell, technisch und wirtschaftlich gleichermaßen leistungsfähig ist. Eine beabsichtigte Übertragung nach Satz 1 ist der anderen Partei rechtzeitig im Voraus mitzuteilen. Das Recht zur Abtretung von Forderungen nach § 398 BGB sowie eine gesetzliche Rechtsnachfolge, insbesondere bei Übertragungen im Sinne des Umwandlungsgesetzes, bleiben von dieser Regelung unberührt.</w:t>
+        <w:t>Beide Parteien sind berechtigt, mit Zustimmung der jeweils anderen Partei, die Rechte und Pflichten aus dem Vertrag als Gesamtheit auf einen Dritten zu übertragen. Der Betreiber hat dem Kunden nachzuweisen, dass der Dritte personell, technisch und wirtschaftlich gleichermaßen leistungsfähig ist. Eine beabsichtigte Übertragung nach Satz 1 ist der anderen Partei rechtzeitig im Voraus mitzuteilen. Das Recht zur Abtretung von Forderungen nach § 398 BGB sowie eine gesetzliche Rechtsnachfolge, insbesondere bei Übertragungen im Sinne des Umwandlungsgesetzes, bleiben von dieser Regelung unberührt.</w:t>
       </w:r>
       <w:bookmarkEnd w:id="41"/>
     </w:p>
@@ -6038,7 +5971,14 @@
           <w:rFonts w:cstheme="majorHAnsi"/>
           <w:szCs w:val="20"/>
         </w:rPr>
-        <w:t xml:space="preserve"> ihm vom anderen Vertragspartner zur Verfügung gestellte Informationsblatt. Die „</w:t>
+        <w:t xml:space="preserve"> ihm </w:t>
+      </w:r>
+      <w:r>
+        <w:rPr>
+          <w:rFonts w:cstheme="majorHAnsi"/>
+          <w:szCs w:val="20"/>
+        </w:rPr>
+        <w:t>vom anderen Vertragspartner zur Verfügung gestellte Informationsblatt. Die „</w:t>
       </w:r>
       <w:r>
         <w:rPr>
@@ -6068,14 +6008,7 @@
           <w:rFonts w:cstheme="majorHAnsi"/>
           <w:szCs w:val="20"/>
         </w:rPr>
-        <w:t xml:space="preserve">beigefügt. Die Vertragspartner sind nicht verpflichtet, das vom anderen Vertragspartner zur Verfügung gestellte Informationsblatt vor der Aushändigung an die betroffenen Personen zu prüfen. Sie sind weiterhin nicht berechtigt, das vom anderen Vertragspartner zur Verfügung gestellte Informationsblatt ohne </w:t>
-      </w:r>
-      <w:r>
-        <w:rPr>
-          <w:rFonts w:cstheme="majorHAnsi"/>
-          <w:szCs w:val="20"/>
-        </w:rPr>
-        <w:t xml:space="preserve">vorherige Zustimmung zu ändern. Es obliegt ausschließlich dem zur Information verpflichteten Vertragspartner, dem anderen Vertragspartner ein den jeweils geltenden rechtlichen Anforderungen entsprechendes Informationsblatt zur Verfügung zu stellen und dieses bei Bedarf auch während der Vertragslaufzeit zu aktualisieren. </w:t>
+        <w:t xml:space="preserve">beigefügt. Die Vertragspartner sind nicht verpflichtet, das vom anderen Vertragspartner zur Verfügung gestellte Informationsblatt vor der Aushändigung an die betroffenen Personen zu prüfen. Sie sind weiterhin nicht berechtigt, das vom anderen Vertragspartner zur Verfügung gestellte Informationsblatt ohne vorherige Zustimmung zu ändern. Es obliegt ausschließlich dem zur Information verpflichteten Vertragspartner, dem anderen Vertragspartner ein den jeweils geltenden rechtlichen Anforderungen entsprechendes Informationsblatt zur Verfügung zu stellen und dieses bei Bedarf auch während der Vertragslaufzeit zu aktualisieren. </w:t>
       </w:r>
     </w:p>
     <w:p>
@@ -6271,6 +6204,7 @@
           <w:rFonts w:cstheme="majorHAnsi"/>
           <w:szCs w:val="20"/>
         </w:rPr>
+        <w:lastRenderedPageBreak/>
         <w:t>Die im Anlagenverzeichnis aufgeführten Anlagen sind wesentlicher Bestandteil dieses Vertrags.</w:t>
       </w:r>
     </w:p>
@@ -6456,7 +6390,14 @@
           <w:rFonts w:cstheme="majorHAnsi"/>
           <w:szCs w:val="20"/>
         </w:rPr>
-        <w:t xml:space="preserve">Anlage 4: Angebot für Betrieb (Angebot Nr. </w:t>
+        <w:t>Anlage 4: Angebot für Betrieb (Angebot Nr</w:t>
+      </w:r>
+      <w:r>
+        <w:rPr>
+          <w:rFonts w:cstheme="majorHAnsi"/>
+          <w:szCs w:val="20"/>
+        </w:rPr>
+        <w:t xml:space="preserve">. </w:t>
       </w:r>
       <w:r>
         <w:rPr>
@@ -6475,7 +6416,6 @@
         <w:t>)</w:t>
       </w:r>
     </w:p>
-    <w:bookmarkEnd w:id="46"/>
     <w:p>
       <w:pPr>
         <w:tabs>
@@ -6484,12 +6424,12 @@
         <w:spacing w:line="276" w:lineRule="auto"/>
         <w:rPr>
           <w:rFonts w:cstheme="majorHAnsi"/>
-          <w:sz w:val="18"/>
-          <w:szCs w:val="18"/>
-        </w:rPr>
-      </w:pPr>
-    </w:p>
-    <w:bookmarkEnd w:id="45"/>
+          <w:color w:val="FF0000"/>
+          <w:szCs w:val="20"/>
+        </w:rPr>
+      </w:pPr>
+    </w:p>
+    <w:bookmarkEnd w:id="46"/>
     <w:p>
       <w:pPr>
         <w:tabs>
@@ -6498,10 +6438,12 @@
         <w:spacing w:line="276" w:lineRule="auto"/>
         <w:rPr>
           <w:rFonts w:cstheme="majorHAnsi"/>
-          <w:szCs w:val="20"/>
-        </w:rPr>
-      </w:pPr>
-    </w:p>
+          <w:sz w:val="18"/>
+          <w:szCs w:val="18"/>
+        </w:rPr>
+      </w:pPr>
+    </w:p>
+    <w:bookmarkEnd w:id="45"/>
     <w:p>
       <w:pPr>
         <w:tabs>
@@ -6529,6 +6471,18 @@
     <w:p>
       <w:pPr>
         <w:tabs>
+          <w:tab w:val="right" w:pos="9072"/>
+        </w:tabs>
+        <w:spacing w:line="276" w:lineRule="auto"/>
+        <w:rPr>
+          <w:rFonts w:cstheme="majorHAnsi"/>
+          <w:szCs w:val="20"/>
+        </w:rPr>
+      </w:pPr>
+    </w:p>
+    <w:p>
+      <w:pPr>
+        <w:tabs>
           <w:tab w:val="left" w:pos="4536"/>
         </w:tabs>
         <w:spacing w:line="276" w:lineRule="auto"/>
@@ -7279,7 +7233,7 @@
         <w:rPr>
           <w:rFonts w:cstheme="majorHAnsi"/>
         </w:rPr>
-        <w:t>{{AP_KFM_MAIL}}</w:t>
+        <w:t>{{AP_KFM_TEL}}</w:t>
       </w:r>
     </w:p>
     <w:p>
@@ -7344,7 +7298,7 @@
         <w:rPr>
           <w:rFonts w:cstheme="majorHAnsi"/>
         </w:rPr>
-        <w:t>{{AP_KFM_TEL}}</w:t>
+        <w:t>{{AP_KFM_MAIL}}</w:t>
       </w:r>
     </w:p>
     <w:p>
@@ -7624,15 +7578,17 @@
     <w:tbl>
       <w:tblPr>
         <w:tblStyle w:val="Tabellenraster"/>
-        <w:tblW w:w="13184" w:type="dxa"/>
+        <w:tblW w:w="13892" w:type="dxa"/>
         <w:tblInd w:w="-289" w:type="dxa"/>
         <w:tblLayout w:type="fixed"/>
         <w:tblLook w:val="04A0" w:firstRow="1" w:lastRow="0" w:firstColumn="1" w:lastColumn="0" w:noHBand="0" w:noVBand="1"/>
       </w:tblPr>
       <w:tblGrid>
-        <w:gridCol w:w="4112"/>
-        <w:gridCol w:w="4394"/>
-        <w:gridCol w:w="4678"/>
+        <w:gridCol w:w="3970"/>
+        <w:gridCol w:w="1984"/>
+        <w:gridCol w:w="1843"/>
+        <w:gridCol w:w="2126"/>
+        <w:gridCol w:w="3969"/>
       </w:tblGrid>
       <w:tr>
         <w:trPr>
@@ -7640,7 +7596,7 @@
         </w:trPr>
         <w:tc>
           <w:tcPr>
-            <w:tcW w:w="4112" w:type="dxa"/>
+            <w:tcW w:w="3970" w:type="dxa"/>
             <w:vAlign w:val="center"/>
           </w:tcPr>
           <w:p>
@@ -7669,7 +7625,7 @@
         </w:tc>
         <w:tc>
           <w:tcPr>
-            <w:tcW w:w="4394" w:type="dxa"/>
+            <w:tcW w:w="1984" w:type="dxa"/>
             <w:vAlign w:val="center"/>
           </w:tcPr>
           <w:p>
@@ -7719,7 +7675,7 @@
         </w:tc>
         <w:tc>
           <w:tcPr>
-            <w:tcW w:w="4678" w:type="dxa"/>
+            <w:tcW w:w="1843" w:type="dxa"/>
             <w:vAlign w:val="center"/>
           </w:tcPr>
           <w:p>
@@ -7767,6 +7723,139 @@
             </w:r>
           </w:p>
         </w:tc>
+        <w:tc>
+          <w:tcPr>
+            <w:tcW w:w="2126" w:type="dxa"/>
+            <w:vAlign w:val="center"/>
+          </w:tcPr>
+          <w:p>
+            <w:pPr>
+              <w:pStyle w:val="paragraph"/>
+              <w:spacing w:before="0" w:beforeAutospacing="0" w:after="0" w:afterAutospacing="0"/>
+              <w:rPr>
+                <w:rFonts w:ascii="Segoe UI" w:hAnsi="Segoe UI" w:cs="Segoe UI"/>
+                <w:sz w:val="18"/>
+                <w:szCs w:val="18"/>
+              </w:rPr>
+            </w:pPr>
+            <w:r>
+              <w:rPr>
+                <w:rStyle w:val="normaltextrun"/>
+                <w:rFonts w:ascii="Calibri Light" w:hAnsi="Calibri Light" w:cs="Calibri Light"/>
+                <w:b/>
+                <w:bCs/>
+                <w:sz w:val="18"/>
+                <w:szCs w:val="18"/>
+              </w:rPr>
+              <w:t>max. Ladeleistung je</w:t>
+            </w:r>
+            <w:r>
+              <w:rPr>
+                <w:rStyle w:val="eop"/>
+                <w:rFonts w:ascii="Calibri Light" w:hAnsi="Calibri Light" w:cs="Calibri Light"/>
+                <w:sz w:val="18"/>
+                <w:szCs w:val="18"/>
+              </w:rPr>
+              <w:t> </w:t>
+            </w:r>
+          </w:p>
+          <w:p>
+            <w:pPr>
+              <w:pStyle w:val="Brieftext"/>
+              <w:spacing w:after="0" w:line="240" w:lineRule="auto"/>
+              <w:jc w:val="left"/>
+              <w:rPr>
+                <w:rFonts w:cstheme="majorHAnsi"/>
+                <w:b/>
+                <w:sz w:val="18"/>
+                <w:szCs w:val="18"/>
+              </w:rPr>
+            </w:pPr>
+            <w:r>
+              <w:rPr>
+                <w:rStyle w:val="normaltextrun"/>
+                <w:rFonts w:ascii="Calibri Light" w:hAnsi="Calibri Light" w:cs="Calibri Light"/>
+                <w:b/>
+                <w:bCs/>
+                <w:sz w:val="18"/>
+                <w:szCs w:val="18"/>
+              </w:rPr>
+              <w:t>Ladepunkt</w:t>
+            </w:r>
+          </w:p>
+        </w:tc>
+        <w:tc>
+          <w:tcPr>
+            <w:tcW w:w="3969" w:type="dxa"/>
+            <w:vAlign w:val="center"/>
+          </w:tcPr>
+          <w:p>
+            <w:pPr>
+              <w:pStyle w:val="paragraph"/>
+              <w:spacing w:before="0" w:beforeAutospacing="0" w:after="0" w:afterAutospacing="0"/>
+              <w:rPr>
+                <w:rFonts w:ascii="Segoe UI" w:hAnsi="Segoe UI" w:cs="Segoe UI"/>
+                <w:sz w:val="18"/>
+                <w:szCs w:val="18"/>
+              </w:rPr>
+            </w:pPr>
+            <w:r>
+              <w:rPr>
+                <w:rStyle w:val="normaltextrun"/>
+                <w:rFonts w:ascii="Calibri Light" w:hAnsi="Calibri Light" w:cs="Calibri Light"/>
+                <w:b/>
+                <w:bCs/>
+                <w:sz w:val="18"/>
+                <w:szCs w:val="18"/>
+              </w:rPr>
+              <w:t>Voraussichtliches </w:t>
+            </w:r>
+            <w:r>
+              <w:rPr>
+                <w:rStyle w:val="eop"/>
+                <w:rFonts w:ascii="Calibri Light" w:hAnsi="Calibri Light" w:cs="Calibri Light"/>
+                <w:sz w:val="18"/>
+                <w:szCs w:val="18"/>
+              </w:rPr>
+              <w:t> </w:t>
+            </w:r>
+          </w:p>
+          <w:p>
+            <w:pPr>
+              <w:pStyle w:val="Brieftext"/>
+              <w:spacing w:after="0" w:line="240" w:lineRule="auto"/>
+              <w:jc w:val="left"/>
+              <w:rPr>
+                <w:rFonts w:cstheme="majorHAnsi"/>
+                <w:b/>
+                <w:sz w:val="18"/>
+                <w:szCs w:val="18"/>
+              </w:rPr>
+            </w:pPr>
+            <w:proofErr w:type="spellStart"/>
+            <w:r>
+              <w:rPr>
+                <w:rStyle w:val="normaltextrun"/>
+                <w:rFonts w:ascii="Calibri Light" w:hAnsi="Calibri Light" w:cs="Calibri Light"/>
+                <w:b/>
+                <w:bCs/>
+                <w:sz w:val="18"/>
+                <w:szCs w:val="18"/>
+              </w:rPr>
+              <w:t>Inbetriebnahmedatum</w:t>
+            </w:r>
+            <w:proofErr w:type="spellEnd"/>
+            <w:r>
+              <w:rPr>
+                <w:rStyle w:val="eop"/>
+                <w:rFonts w:ascii="Calibri Light" w:hAnsi="Calibri Light" w:cs="Calibri Light"/>
+                <w:sz w:val="18"/>
+                <w:szCs w:val="18"/>
+              </w:rPr>
+              <w:t> </w:t>
+            </w:r>
+          </w:p>
+        </w:tc>
       </w:tr>
       <w:tr>
         <w:trPr>
@@ -7774,7 +7863,7 @@
         </w:trPr>
         <w:tc>
           <w:tcPr>
-            <w:tcW w:w="4112" w:type="dxa"/>
+            <w:tcW w:w="3970" w:type="dxa"/>
             <w:vAlign w:val="center"/>
           </w:tcPr>
           <w:p>
@@ -7799,7 +7888,7 @@
         </w:tc>
         <w:tc>
           <w:tcPr>
-            <w:tcW w:w="4394" w:type="dxa"/>
+            <w:tcW w:w="1984" w:type="dxa"/>
             <w:vAlign w:val="center"/>
           </w:tcPr>
           <w:p>
@@ -7824,7 +7913,7 @@
         </w:tc>
         <w:tc>
           <w:tcPr>
-            <w:tcW w:w="4678" w:type="dxa"/>
+            <w:tcW w:w="1843" w:type="dxa"/>
             <w:vAlign w:val="center"/>
           </w:tcPr>
           <w:p>
@@ -7847,6 +7936,54 @@
             </w:r>
           </w:p>
         </w:tc>
+        <w:tc>
+          <w:tcPr>
+            <w:tcW w:w="2126" w:type="dxa"/>
+            <w:vAlign w:val="center"/>
+          </w:tcPr>
+          <w:p>
+            <w:pPr>
+              <w:pStyle w:val="Brieftext"/>
+              <w:spacing w:after="0" w:line="240" w:lineRule="auto"/>
+              <w:jc w:val="left"/>
+              <w:rPr>
+                <w:rFonts w:ascii="Arial" w:hAnsi="Arial" w:cs="Arial"/>
+                <w:sz w:val="18"/>
+              </w:rPr>
+            </w:pPr>
+            <w:r>
+              <w:rPr>
+                <w:rFonts w:ascii="Arial" w:hAnsi="Arial" w:cs="Arial"/>
+                <w:sz w:val="18"/>
+              </w:rPr>
+              <w:t>22 kW</w:t>
+            </w:r>
+          </w:p>
+        </w:tc>
+        <w:tc>
+          <w:tcPr>
+            <w:tcW w:w="3969" w:type="dxa"/>
+            <w:vAlign w:val="center"/>
+          </w:tcPr>
+          <w:p>
+            <w:pPr>
+              <w:pStyle w:val="Brieftext"/>
+              <w:spacing w:after="0" w:line="240" w:lineRule="auto"/>
+              <w:jc w:val="left"/>
+              <w:rPr>
+                <w:rFonts w:ascii="Arial" w:hAnsi="Arial" w:cs="Arial"/>
+                <w:sz w:val="18"/>
+              </w:rPr>
+            </w:pPr>
+            <w:r>
+              <w:rPr>
+                <w:rFonts w:ascii="Arial" w:hAnsi="Arial" w:cs="Arial"/>
+                <w:sz w:val="18"/>
+              </w:rPr>
+              <w:t>{{INBETRIEBNAHME}}</w:t>
+            </w:r>
+          </w:p>
+        </w:tc>
       </w:tr>
       <w:bookmarkEnd w:id="50"/>
       <w:bookmarkEnd w:id="51"/>
@@ -7896,6 +8033,28 @@
         </w:rPr>
         <w:lastRenderedPageBreak/>
         <w:t>Anlage 3: Informationen zur Verarbeitung personenbezogener Daten</w:t>
+      </w:r>
+    </w:p>
+    <w:p>
+      <w:pPr>
+        <w:tabs>
+          <w:tab w:val="left" w:pos="3192"/>
+        </w:tabs>
+        <w:rPr>
+          <w:rFonts w:cstheme="majorHAnsi"/>
+          <w:b/>
+          <w:bCs/>
+          <w:szCs w:val="20"/>
+        </w:rPr>
+      </w:pPr>
+      <w:r>
+        <w:rPr>
+          <w:rFonts w:cstheme="majorHAnsi"/>
+          <w:b/>
+          <w:bCs/>
+          <w:szCs w:val="20"/>
+        </w:rPr>
+        <w:t>Stand: {{DATUM}}</w:t>
       </w:r>
     </w:p>
     <w:p>
@@ -9029,6 +9188,7 @@
           <w:rFonts w:cstheme="majorHAnsi"/>
           <w:szCs w:val="20"/>
         </w:rPr>
+        <w:lastRenderedPageBreak/>
         <w:t>Abrechnungsdaten (z. B. Bankverbindungsdaten)</w:t>
       </w:r>
     </w:p>
@@ -9051,7 +9211,6 @@
           <w:rFonts w:cstheme="majorHAnsi"/>
           <w:szCs w:val="20"/>
         </w:rPr>
-        <w:lastRenderedPageBreak/>
         <w:t>Daten zum Zahlungsverhalten</w:t>
       </w:r>
     </w:p>
@@ -9620,6 +9779,7 @@
           <w:rFonts w:cstheme="majorHAnsi"/>
           <w:szCs w:val="20"/>
         </w:rPr>
+        <w:lastRenderedPageBreak/>
         <w:t>Personenbezogene Daten werden gespeichert, solange dies für die Erfüllung der unter Ziffer 4 genannten Zwecke erforderlich ist. Nach Wegfall des Verarbeitungszwecks werden die Daten gelöscht, sofern keine gesetzlichen Aufbewahrungspflichten entgegenstehen.</w:t>
       </w:r>
     </w:p>
@@ -9638,7 +9798,6 @@
           <w:rFonts w:cstheme="majorHAnsi"/>
           <w:szCs w:val="20"/>
         </w:rPr>
-        <w:lastRenderedPageBreak/>
         <w:t>Gesetzliche Aufbewahrungspflichten bestehen insbesondere nach:</w:t>
       </w:r>
     </w:p>
@@ -10575,6 +10734,7 @@
           <w:rFonts w:cstheme="majorHAnsi"/>
           <w:szCs w:val="20"/>
         </w:rPr>
+        <w:lastRenderedPageBreak/>
         <w:t>Im Rahmen des Vertrages hat der Kunde diejenigen personenbezogenen Daten bereitzustellen, die für den Abschluss und die Durchführung des Vertrages erforderlich sind. Ohne die erforderlichen Daten kann der Vertrag gegebenenfalls nicht abgeschlossen bzw. erfüllt werden.</w:t>
       </w:r>
     </w:p>
@@ -10607,7 +10767,6 @@
           <w:bCs/>
           <w:szCs w:val="20"/>
         </w:rPr>
-        <w:lastRenderedPageBreak/>
         <w:t>12. Automatisierte Entscheidungsfindung</w:t>
       </w:r>
     </w:p>
@@ -14982,6 +15141,30 @@
       <w:szCs w:val="22"/>
     </w:rPr>
   </w:style>
+  <w:style w:type="character" w:customStyle="1" w:styleId="normaltextrun">
+    <w:name w:val="normaltextrun"/>
+    <w:basedOn w:val="Absatz-Standardschriftart"/>
+    <w:rsid w:val="00057798"/>
+  </w:style>
+  <w:style w:type="character" w:customStyle="1" w:styleId="eop">
+    <w:name w:val="eop"/>
+    <w:basedOn w:val="Absatz-Standardschriftart"/>
+    <w:rsid w:val="00057798"/>
+  </w:style>
+  <w:style w:type="paragraph" w:customStyle="1" w:styleId="paragraph">
+    <w:name w:val="paragraph"/>
+    <w:basedOn w:val="Standard"/>
+    <w:rsid w:val="00057798"/>
+    <w:pPr>
+      <w:spacing w:before="100" w:beforeAutospacing="1" w:after="100" w:afterAutospacing="1" w:line="240" w:lineRule="auto"/>
+      <w:jc w:val="left"/>
+    </w:pPr>
+    <w:rPr>
+      <w:rFonts w:ascii="Times New Roman" w:hAnsi="Times New Roman"/>
+      <w:sz w:val="24"/>
+      <w:szCs w:val="24"/>
+    </w:rPr>
+  </w:style>
 </w:styles>
 </file>
 
@@ -15018,40 +15201,6 @@
               <w:highlight w:val="yellow"/>
             </w:rPr>
             <w:t>[Anzahl Jahre]</w:t>
-          </w:r>
-        </w:p>
-      </w:docPartBody>
-    </w:docPart>
-    <w:docPart>
-      <w:docPartPr>
-        <w:name w:val="43425BF57C0D4F8F8C24203B8D721051"/>
-        <w:category>
-          <w:name w:val="Allgemein"/>
-          <w:gallery w:val="placeholder"/>
-        </w:category>
-        <w:types>
-          <w:type w:val="bbPlcHdr"/>
-        </w:types>
-        <w:behaviors>
-          <w:behavior w:val="content"/>
-        </w:behaviors>
-        <w:guid w:val="{B7C481E0-765B-4A6C-9B23-7FDAD45DA01C}"/>
-      </w:docPartPr>
-      <w:docPartBody>
-        <w:p>
-          <w:pPr>
-            <w:pStyle w:val="43425BF57C0D4F8F8C24203B8D721051"/>
-          </w:pPr>
-          <w:r>
-            <w:rPr>
-              <w:rStyle w:val="Platzhaltertext"/>
-              <w:rFonts w:cstheme="majorHAnsi"/>
-              <w:b/>
-              <w:bCs/>
-              <w:szCs w:val="20"/>
-              <w:highlight w:val="yellow"/>
-            </w:rPr>
-            <w:t>[zehn/14/21/30]</w:t>
           </w:r>
         </w:p>
       </w:docPartBody>
@@ -15176,6 +15325,13 @@
     <w:pitch w:val="variable"/>
     <w:sig w:usb0="800001E3" w:usb1="1200FFEF" w:usb2="00040000" w:usb3="00000000" w:csb0="00000001" w:csb1="00000000"/>
   </w:font>
+  <w:font w:name="Segoe UI">
+    <w:panose1 w:val="020B0502040204020203"/>
+    <w:charset w:val="00"/>
+    <w:family w:val="swiss"/>
+    <w:pitch w:val="variable"/>
+    <w:sig w:usb0="E4002EFF" w:usb1="C000E47F" w:usb2="00000009" w:usb3="00000000" w:csb0="000001FF" w:csb1="00000000"/>
+  </w:font>
   <w:font w:name="Aptos">
     <w:charset w:val="00"/>
     <w:family w:val="swiss"/>
@@ -15194,6 +15350,7 @@
 <file path=word/glossary/settings.xml><?xml version="1.0" encoding="utf-8"?>
 <w:settings xmlns:mc="http://schemas.openxmlformats.org/markup-compatibility/2006" xmlns:o="urn:schemas-microsoft-com:office:office" xmlns:r="http://schemas.openxmlformats.org/officeDocument/2006/relationships" xmlns:m="http://schemas.openxmlformats.org/officeDocument/2006/math" xmlns:v="urn:schemas-microsoft-com:vml" xmlns:w10="urn:schemas-microsoft-com:office:word" xmlns:w="http://schemas.openxmlformats.org/wordprocessingml/2006/main" xmlns:w14="http://schemas.microsoft.com/office/word/2010/wordml" xmlns:w15="http://schemas.microsoft.com/office/word/2012/wordml" xmlns:w16cex="http://schemas.microsoft.com/office/word/2018/wordml/cex" xmlns:w16cid="http://schemas.microsoft.com/office/word/2016/wordml/cid" xmlns:w16="http://schemas.microsoft.com/office/word/2018/wordml" xmlns:w16du="http://schemas.microsoft.com/office/word/2023/wordml/word16du" xmlns:w16sdtdh="http://schemas.microsoft.com/office/word/2020/wordml/sdtdatahash" xmlns:w16sdtfl="http://schemas.microsoft.com/office/word/2024/wordml/sdtformatlock" xmlns:w16se="http://schemas.microsoft.com/office/word/2015/wordml/symex" xmlns:sl="http://schemas.openxmlformats.org/schemaLibrary/2006/main" mc:Ignorable="w14 w15 w16se w16cid w16 w16cex w16sdtdh w16sdtfl w16du">
   <w:view w:val="normal"/>
+  <w:revisionView w:inkAnnotations="0"/>
   <w:defaultTabStop w:val="708"/>
   <w:hyphenationZone w:val="425"/>
   <w:characterSpacingControl w:val="doNotCompress"/>
@@ -15208,15 +15365,21 @@
   </w:compat>
   <w:rsids>
     <w:rsidRoot w:val="003138D4"/>
+    <w:rsid w:val="00144CAD"/>
+    <w:rsid w:val="00187521"/>
     <w:rsid w:val="002522A8"/>
     <w:rsid w:val="002B243A"/>
     <w:rsid w:val="003138D4"/>
     <w:rsid w:val="0035401D"/>
     <w:rsid w:val="003C0051"/>
     <w:rsid w:val="003D31A3"/>
+    <w:rsid w:val="00483DB8"/>
     <w:rsid w:val="005060C1"/>
     <w:rsid w:val="00606B2D"/>
     <w:rsid w:val="006416D5"/>
+    <w:rsid w:val="006478EA"/>
+    <w:rsid w:val="00984086"/>
+    <w:rsid w:val="00AC5AB9"/>
     <w:rsid w:val="00AE645E"/>
     <w:rsid w:val="00D61157"/>
     <w:rsid w:val="00EA0E83"/>
@@ -16228,12 +16391,7 @@
 </file>
 
 <file path=customXml/item3.xml><?xml version="1.0" encoding="utf-8"?>
-<?mso-contentType ?>
-<FormTemplates xmlns="http://schemas.microsoft.com/sharepoint/v3/contenttype/forms">
-  <Display>DocumentLibraryForm</Display>
-  <Edit>DocumentLibraryForm</Edit>
-  <New>DocumentLibraryForm</New>
-</FormTemplates>
+<b:Sources xmlns:b="http://schemas.openxmlformats.org/officeDocument/2006/bibliography" xmlns="http://schemas.openxmlformats.org/officeDocument/2006/bibliography" SelectedStyle="\APASixthEditionOfficeOnline.xsl" StyleName="APA" Version="6"/>
 </file>
 
 <file path=customXml/item4.xml><?xml version="1.0" encoding="utf-8"?>
@@ -16248,7 +16406,12 @@
 </file>
 
 <file path=customXml/item5.xml><?xml version="1.0" encoding="utf-8"?>
-<b:Sources xmlns:b="http://schemas.openxmlformats.org/officeDocument/2006/bibliography" xmlns="http://schemas.openxmlformats.org/officeDocument/2006/bibliography" SelectedStyle="\APASixthEditionOfficeOnline.xsl" StyleName="APA" Version="6"/>
+<?mso-contentType ?>
+<FormTemplates xmlns="http://schemas.microsoft.com/sharepoint/v3/contenttype/forms">
+  <Display>DocumentLibraryForm</Display>
+  <Edit>DocumentLibraryForm</Edit>
+  <New>DocumentLibraryForm</New>
+</FormTemplates>
 </file>
 
 <file path=customXml/itemProps1.xml><?xml version="1.0" encoding="utf-8"?>
@@ -16279,9 +16442,9 @@
 </file>
 
 <file path=customXml/itemProps3.xml><?xml version="1.0" encoding="utf-8"?>
-<ds:datastoreItem xmlns:ds="http://schemas.openxmlformats.org/officeDocument/2006/customXml" ds:itemID="{846A5F5F-0CE6-4451-8402-A8F05F356EE1}">
+<ds:datastoreItem xmlns:ds="http://schemas.openxmlformats.org/officeDocument/2006/customXml" ds:itemID="{0E70647D-1F0C-48C2-B100-F272D9CEE62E}">
   <ds:schemaRefs>
-    <ds:schemaRef ds:uri="http://schemas.microsoft.com/sharepoint/v3/contenttype/forms"/>
+    <ds:schemaRef ds:uri="http://schemas.openxmlformats.org/officeDocument/2006/bibliography"/>
   </ds:schemaRefs>
 </ds:datastoreItem>
 </file>
@@ -16298,9 +16461,9 @@
 </file>
 
 <file path=customXml/itemProps5.xml><?xml version="1.0" encoding="utf-8"?>
-<ds:datastoreItem xmlns:ds="http://schemas.openxmlformats.org/officeDocument/2006/customXml" ds:itemID="{0E70647D-1F0C-48C2-B100-F272D9CEE62E}">
+<ds:datastoreItem xmlns:ds="http://schemas.openxmlformats.org/officeDocument/2006/customXml" ds:itemID="{846A5F5F-0CE6-4451-8402-A8F05F356EE1}">
   <ds:schemaRefs>
-    <ds:schemaRef ds:uri="http://schemas.openxmlformats.org/officeDocument/2006/bibliography"/>
+    <ds:schemaRef ds:uri="http://schemas.microsoft.com/sharepoint/v3/contenttype/forms"/>
   </ds:schemaRefs>
 </ds:datastoreItem>
 </file>
</xml_diff>

<commit_message>
Vollbetrieb ohne Strom: LAUFZEIT-Platzhalter (war ueber 3 Runs gesplittet) konsolidiert
</commit_message>
<xml_diff>
--- a/AMBA_Vollbetrieb_ohne_Strom_Vorlage.docx
+++ b/AMBA_Vollbetrieb_ohne_Strom_Vorlage.docx
@@ -5334,13 +5334,7 @@
         <w:t xml:space="preserve">Der Vertrag beginnt mit beidseitiger Unterzeichnung. Die Mindestlaufzeit </w:t>
       </w:r>
       <w:r>
-        <w:t>{{L</w:t>
-      </w:r>
-      <w:r>
-        <w:t>AUFZEIT</w:t>
-      </w:r>
-      <w:r>
-        <w:t>}}</w:t>
+        <w:t>{{LAUFZEIT}}</w:t>
       </w:r>
       <w:r>
         <w:t xml:space="preserve"> beginnt mit dem Betriebsbeginn. Verzögert sich der Betriebsbeginn aus Gründen, die der Betreiber nicht zu vertreten hat – insbesondere wegen fehlender Betriebsbereitschaft der Ladeeinrichtungen oder unvollständiger Vorleistungen des Kunden – verschiebt sich der Betriebsbeginn entsprechend, ohne dass hieraus Ansprüche gegen den Betreiber </w:t>

</xml_diff>